<commit_message>
Updated presentation up to economy rework
Keeping things up to date
</commit_message>
<xml_diff>
--- a/PIGDE - Group 8 - Assessment 1 Part B - Realm/Peer Assessment Form - Group 8.docx
+++ b/PIGDE - Group 8 - Assessment 1 Part B - Realm/Peer Assessment Form - Group 8.docx
@@ -33,7 +33,7 @@
     </w:p>
     <w:tbl>
       <w:tblPr>
-        <w:tblW w:w="9214" w:type="dxa"/>
+        <w:tblW w:w="8642" w:type="dxa"/>
         <w:tblInd w:w="108" w:type="dxa"/>
         <w:tblBorders>
           <w:top w:val="single" w:sz="4" w:space="0" w:color="auto"/>
@@ -46,17 +46,19 @@
         <w:tblLook w:val="04A0" w:firstRow="1" w:lastRow="0" w:firstColumn="1" w:lastColumn="0" w:noHBand="0" w:noVBand="1"/>
       </w:tblPr>
       <w:tblGrid>
-        <w:gridCol w:w="1418"/>
-        <w:gridCol w:w="1559"/>
-        <w:gridCol w:w="1559"/>
-        <w:gridCol w:w="1560"/>
-        <w:gridCol w:w="1559"/>
-        <w:gridCol w:w="1559"/>
+        <w:gridCol w:w="1601"/>
+        <w:gridCol w:w="1760"/>
+        <w:gridCol w:w="1760"/>
+        <w:gridCol w:w="1761"/>
+        <w:gridCol w:w="1760"/>
       </w:tblGrid>
       <w:tr>
-        <w:tc>
-          <w:tcPr>
-            <w:tcW w:w="1418" w:type="dxa"/>
+        <w:trPr>
+          <w:trHeight w:val="1487"/>
+        </w:trPr>
+        <w:tc>
+          <w:tcPr>
+            <w:tcW w:w="1601" w:type="dxa"/>
             <w:shd w:val="clear" w:color="auto" w:fill="BDD6EE"/>
             <w:vAlign w:val="center"/>
           </w:tcPr>
@@ -77,7 +79,7 @@
         </w:tc>
         <w:tc>
           <w:tcPr>
-            <w:tcW w:w="1559" w:type="dxa"/>
+            <w:tcW w:w="1760" w:type="dxa"/>
             <w:shd w:val="clear" w:color="auto" w:fill="BDD6EE"/>
           </w:tcPr>
           <w:p>
@@ -97,10 +99,7 @@
               <w:jc w:val="center"/>
             </w:pPr>
             <w:r>
-              <w:t>Fin H.</w:t>
-            </w:r>
-            <w:r>
-              <w:t xml:space="preserve"> </w:t>
+              <w:t xml:space="preserve">Fin H. </w:t>
             </w:r>
           </w:p>
           <w:p>
@@ -117,7 +116,7 @@
         </w:tc>
         <w:tc>
           <w:tcPr>
-            <w:tcW w:w="1559" w:type="dxa"/>
+            <w:tcW w:w="1760" w:type="dxa"/>
             <w:shd w:val="clear" w:color="auto" w:fill="BDD6EE"/>
           </w:tcPr>
           <w:p>
@@ -137,10 +136,7 @@
               <w:jc w:val="center"/>
             </w:pPr>
             <w:r>
-              <w:t>Hritesh L.</w:t>
-            </w:r>
-            <w:r>
-              <w:t xml:space="preserve"> </w:t>
+              <w:t xml:space="preserve">Hritesh L. </w:t>
             </w:r>
           </w:p>
           <w:p>
@@ -157,7 +153,7 @@
         </w:tc>
         <w:tc>
           <w:tcPr>
-            <w:tcW w:w="1560" w:type="dxa"/>
+            <w:tcW w:w="1761" w:type="dxa"/>
             <w:shd w:val="clear" w:color="auto" w:fill="BDD6EE"/>
           </w:tcPr>
           <w:p>
@@ -177,10 +173,7 @@
               <w:jc w:val="center"/>
             </w:pPr>
             <w:r>
-              <w:t>Dylan V.</w:t>
-            </w:r>
-            <w:r>
-              <w:t xml:space="preserve"> </w:t>
+              <w:t xml:space="preserve">Dylan V. </w:t>
             </w:r>
           </w:p>
           <w:p>
@@ -197,7 +190,7 @@
         </w:tc>
         <w:tc>
           <w:tcPr>
-            <w:tcW w:w="1559" w:type="dxa"/>
+            <w:tcW w:w="1760" w:type="dxa"/>
             <w:shd w:val="clear" w:color="auto" w:fill="BDD6EE"/>
           </w:tcPr>
           <w:p>
@@ -217,10 +210,7 @@
               <w:jc w:val="center"/>
             </w:pPr>
             <w:r>
-              <w:t>Skye W.</w:t>
-            </w:r>
-            <w:r>
-              <w:t xml:space="preserve"> </w:t>
+              <w:t xml:space="preserve">Skye W. </w:t>
             </w:r>
           </w:p>
           <w:p>
@@ -232,40 +222,17 @@
             </w:r>
             <w:r>
               <w:t>2267728</w:t>
-            </w:r>
-          </w:p>
-        </w:tc>
-        <w:tc>
-          <w:tcPr>
-            <w:tcW w:w="1559" w:type="dxa"/>
-            <w:shd w:val="clear" w:color="auto" w:fill="BDD6EE"/>
-          </w:tcPr>
-          <w:p>
-            <w:pPr>
-              <w:jc w:val="center"/>
-            </w:pPr>
-            <w:r>
-              <w:t xml:space="preserve">Team Member </w:t>
-            </w:r>
-            <w:r>
-              <w:br/>
-              <w:t>E:</w:t>
-            </w:r>
-          </w:p>
-          <w:p>
-            <w:pPr>
-              <w:jc w:val="center"/>
-            </w:pPr>
-            <w:r>
-              <w:t xml:space="preserve">_ _ _ _ _ _ _ </w:t>
             </w:r>
           </w:p>
         </w:tc>
       </w:tr>
       <w:tr>
-        <w:tc>
-          <w:tcPr>
-            <w:tcW w:w="1418" w:type="dxa"/>
+        <w:trPr>
+          <w:trHeight w:val="1096"/>
+        </w:trPr>
+        <w:tc>
+          <w:tcPr>
+            <w:tcW w:w="1601" w:type="dxa"/>
             <w:shd w:val="clear" w:color="auto" w:fill="BDD6EE"/>
           </w:tcPr>
           <w:p>
@@ -290,7 +257,7 @@
         </w:tc>
         <w:tc>
           <w:tcPr>
-            <w:tcW w:w="1559" w:type="dxa"/>
+            <w:tcW w:w="1760" w:type="dxa"/>
             <w:shd w:val="clear" w:color="auto" w:fill="595959"/>
             <w:vAlign w:val="center"/>
           </w:tcPr>
@@ -302,56 +269,45 @@
         </w:tc>
         <w:tc>
           <w:tcPr>
-            <w:tcW w:w="1559" w:type="dxa"/>
-            <w:vAlign w:val="center"/>
-          </w:tcPr>
-          <w:p>
-            <w:pPr>
-              <w:jc w:val="center"/>
-            </w:pPr>
-          </w:p>
-        </w:tc>
-        <w:tc>
-          <w:tcPr>
-            <w:tcW w:w="1560" w:type="dxa"/>
-            <w:vAlign w:val="center"/>
-          </w:tcPr>
-          <w:p>
-            <w:pPr>
-              <w:jc w:val="center"/>
-            </w:pPr>
-          </w:p>
-        </w:tc>
-        <w:tc>
-          <w:tcPr>
-            <w:tcW w:w="1559" w:type="dxa"/>
-            <w:vAlign w:val="center"/>
-          </w:tcPr>
-          <w:p>
-            <w:pPr>
-              <w:jc w:val="center"/>
-            </w:pPr>
-          </w:p>
-        </w:tc>
-        <w:tc>
-          <w:tcPr>
-            <w:tcW w:w="1559" w:type="dxa"/>
-            <w:vAlign w:val="center"/>
-          </w:tcPr>
-          <w:p>
-            <w:pPr>
-              <w:jc w:val="center"/>
-            </w:pPr>
-            <w:r>
-              <w:t>-</w:t>
-            </w:r>
+            <w:tcW w:w="1760" w:type="dxa"/>
+            <w:vAlign w:val="center"/>
+          </w:tcPr>
+          <w:p>
+            <w:pPr>
+              <w:jc w:val="center"/>
+            </w:pPr>
+          </w:p>
+        </w:tc>
+        <w:tc>
+          <w:tcPr>
+            <w:tcW w:w="1761" w:type="dxa"/>
+            <w:vAlign w:val="center"/>
+          </w:tcPr>
+          <w:p>
+            <w:pPr>
+              <w:jc w:val="center"/>
+            </w:pPr>
+          </w:p>
+        </w:tc>
+        <w:tc>
+          <w:tcPr>
+            <w:tcW w:w="1760" w:type="dxa"/>
+            <w:vAlign w:val="center"/>
+          </w:tcPr>
+          <w:p>
+            <w:pPr>
+              <w:jc w:val="center"/>
+            </w:pPr>
           </w:p>
         </w:tc>
       </w:tr>
       <w:tr>
-        <w:tc>
-          <w:tcPr>
-            <w:tcW w:w="1418" w:type="dxa"/>
+        <w:trPr>
+          <w:trHeight w:val="1080"/>
+        </w:trPr>
+        <w:tc>
+          <w:tcPr>
+            <w:tcW w:w="1601" w:type="dxa"/>
             <w:shd w:val="clear" w:color="auto" w:fill="BDD6EE"/>
           </w:tcPr>
           <w:p>
@@ -373,18 +329,18 @@
         </w:tc>
         <w:tc>
           <w:tcPr>
-            <w:tcW w:w="1559" w:type="dxa"/>
-            <w:vAlign w:val="center"/>
-          </w:tcPr>
-          <w:p>
-            <w:pPr>
-              <w:jc w:val="center"/>
-            </w:pPr>
-          </w:p>
-        </w:tc>
-        <w:tc>
-          <w:tcPr>
-            <w:tcW w:w="1559" w:type="dxa"/>
+            <w:tcW w:w="1760" w:type="dxa"/>
+            <w:vAlign w:val="center"/>
+          </w:tcPr>
+          <w:p>
+            <w:pPr>
+              <w:jc w:val="center"/>
+            </w:pPr>
+          </w:p>
+        </w:tc>
+        <w:tc>
+          <w:tcPr>
+            <w:tcW w:w="1760" w:type="dxa"/>
             <w:shd w:val="clear" w:color="auto" w:fill="595959"/>
             <w:vAlign w:val="center"/>
           </w:tcPr>
@@ -396,45 +352,34 @@
         </w:tc>
         <w:tc>
           <w:tcPr>
-            <w:tcW w:w="1560" w:type="dxa"/>
-            <w:vAlign w:val="center"/>
-          </w:tcPr>
-          <w:p>
-            <w:pPr>
-              <w:jc w:val="center"/>
-            </w:pPr>
-          </w:p>
-        </w:tc>
-        <w:tc>
-          <w:tcPr>
-            <w:tcW w:w="1559" w:type="dxa"/>
-            <w:vAlign w:val="center"/>
-          </w:tcPr>
-          <w:p>
-            <w:pPr>
-              <w:jc w:val="center"/>
-            </w:pPr>
-          </w:p>
-        </w:tc>
-        <w:tc>
-          <w:tcPr>
-            <w:tcW w:w="1559" w:type="dxa"/>
-            <w:vAlign w:val="center"/>
-          </w:tcPr>
-          <w:p>
-            <w:pPr>
-              <w:jc w:val="center"/>
-            </w:pPr>
-            <w:r>
-              <w:t>-</w:t>
-            </w:r>
+            <w:tcW w:w="1761" w:type="dxa"/>
+            <w:vAlign w:val="center"/>
+          </w:tcPr>
+          <w:p>
+            <w:pPr>
+              <w:jc w:val="center"/>
+            </w:pPr>
+          </w:p>
+        </w:tc>
+        <w:tc>
+          <w:tcPr>
+            <w:tcW w:w="1760" w:type="dxa"/>
+            <w:vAlign w:val="center"/>
+          </w:tcPr>
+          <w:p>
+            <w:pPr>
+              <w:jc w:val="center"/>
+            </w:pPr>
           </w:p>
         </w:tc>
       </w:tr>
       <w:tr>
-        <w:tc>
-          <w:tcPr>
-            <w:tcW w:w="1418" w:type="dxa"/>
+        <w:trPr>
+          <w:trHeight w:val="1080"/>
+        </w:trPr>
+        <w:tc>
+          <w:tcPr>
+            <w:tcW w:w="1601" w:type="dxa"/>
             <w:shd w:val="clear" w:color="auto" w:fill="BDD6EE"/>
           </w:tcPr>
           <w:p>
@@ -450,38 +395,35 @@
               <w:jc w:val="center"/>
             </w:pPr>
             <w:r>
-              <w:t>Dylan V.</w:t>
-            </w:r>
-            <w:r>
-              <w:t xml:space="preserve"> </w:t>
-            </w:r>
-          </w:p>
-        </w:tc>
-        <w:tc>
-          <w:tcPr>
-            <w:tcW w:w="1559" w:type="dxa"/>
-            <w:vAlign w:val="center"/>
-          </w:tcPr>
-          <w:p>
-            <w:pPr>
-              <w:jc w:val="center"/>
-            </w:pPr>
-          </w:p>
-        </w:tc>
-        <w:tc>
-          <w:tcPr>
-            <w:tcW w:w="1559" w:type="dxa"/>
-            <w:vAlign w:val="center"/>
-          </w:tcPr>
-          <w:p>
-            <w:pPr>
-              <w:jc w:val="center"/>
-            </w:pPr>
-          </w:p>
-        </w:tc>
-        <w:tc>
-          <w:tcPr>
-            <w:tcW w:w="1560" w:type="dxa"/>
+              <w:t xml:space="preserve">Dylan V. </w:t>
+            </w:r>
+          </w:p>
+        </w:tc>
+        <w:tc>
+          <w:tcPr>
+            <w:tcW w:w="1760" w:type="dxa"/>
+            <w:vAlign w:val="center"/>
+          </w:tcPr>
+          <w:p>
+            <w:pPr>
+              <w:jc w:val="center"/>
+            </w:pPr>
+          </w:p>
+        </w:tc>
+        <w:tc>
+          <w:tcPr>
+            <w:tcW w:w="1760" w:type="dxa"/>
+            <w:vAlign w:val="center"/>
+          </w:tcPr>
+          <w:p>
+            <w:pPr>
+              <w:jc w:val="center"/>
+            </w:pPr>
+          </w:p>
+        </w:tc>
+        <w:tc>
+          <w:tcPr>
+            <w:tcW w:w="1761" w:type="dxa"/>
             <w:shd w:val="clear" w:color="auto" w:fill="595959"/>
             <w:vAlign w:val="center"/>
           </w:tcPr>
@@ -493,34 +435,23 @@
         </w:tc>
         <w:tc>
           <w:tcPr>
-            <w:tcW w:w="1559" w:type="dxa"/>
-            <w:vAlign w:val="center"/>
-          </w:tcPr>
-          <w:p>
-            <w:pPr>
-              <w:jc w:val="center"/>
-            </w:pPr>
-          </w:p>
-        </w:tc>
-        <w:tc>
-          <w:tcPr>
-            <w:tcW w:w="1559" w:type="dxa"/>
-            <w:vAlign w:val="center"/>
-          </w:tcPr>
-          <w:p>
-            <w:pPr>
-              <w:jc w:val="center"/>
-            </w:pPr>
-            <w:r>
-              <w:t>-</w:t>
-            </w:r>
+            <w:tcW w:w="1760" w:type="dxa"/>
+            <w:vAlign w:val="center"/>
+          </w:tcPr>
+          <w:p>
+            <w:pPr>
+              <w:jc w:val="center"/>
+            </w:pPr>
           </w:p>
         </w:tc>
       </w:tr>
       <w:tr>
-        <w:tc>
-          <w:tcPr>
-            <w:tcW w:w="1418" w:type="dxa"/>
+        <w:trPr>
+          <w:trHeight w:val="1096"/>
+        </w:trPr>
+        <w:tc>
+          <w:tcPr>
+            <w:tcW w:w="1601" w:type="dxa"/>
             <w:shd w:val="clear" w:color="auto" w:fill="BDD6EE"/>
           </w:tcPr>
           <w:p>
@@ -542,40 +473,40 @@
         </w:tc>
         <w:tc>
           <w:tcPr>
-            <w:tcW w:w="1559" w:type="dxa"/>
-            <w:vAlign w:val="center"/>
-          </w:tcPr>
-          <w:p>
-            <w:pPr>
-              <w:jc w:val="center"/>
-            </w:pPr>
-          </w:p>
-        </w:tc>
-        <w:tc>
-          <w:tcPr>
-            <w:tcW w:w="1559" w:type="dxa"/>
-            <w:vAlign w:val="center"/>
-          </w:tcPr>
-          <w:p>
-            <w:pPr>
-              <w:jc w:val="center"/>
-            </w:pPr>
-          </w:p>
-        </w:tc>
-        <w:tc>
-          <w:tcPr>
-            <w:tcW w:w="1560" w:type="dxa"/>
-            <w:vAlign w:val="center"/>
-          </w:tcPr>
-          <w:p>
-            <w:pPr>
-              <w:jc w:val="center"/>
-            </w:pPr>
-          </w:p>
-        </w:tc>
-        <w:tc>
-          <w:tcPr>
-            <w:tcW w:w="1559" w:type="dxa"/>
+            <w:tcW w:w="1760" w:type="dxa"/>
+            <w:vAlign w:val="center"/>
+          </w:tcPr>
+          <w:p>
+            <w:pPr>
+              <w:jc w:val="center"/>
+            </w:pPr>
+          </w:p>
+        </w:tc>
+        <w:tc>
+          <w:tcPr>
+            <w:tcW w:w="1760" w:type="dxa"/>
+            <w:vAlign w:val="center"/>
+          </w:tcPr>
+          <w:p>
+            <w:pPr>
+              <w:jc w:val="center"/>
+            </w:pPr>
+          </w:p>
+        </w:tc>
+        <w:tc>
+          <w:tcPr>
+            <w:tcW w:w="1761" w:type="dxa"/>
+            <w:vAlign w:val="center"/>
+          </w:tcPr>
+          <w:p>
+            <w:pPr>
+              <w:jc w:val="center"/>
+            </w:pPr>
+          </w:p>
+        </w:tc>
+        <w:tc>
+          <w:tcPr>
+            <w:tcW w:w="1760" w:type="dxa"/>
             <w:shd w:val="clear" w:color="auto" w:fill="595959"/>
             <w:vAlign w:val="center"/>
           </w:tcPr>
@@ -583,119 +514,16 @@
             <w:pPr>
               <w:jc w:val="center"/>
             </w:pPr>
-          </w:p>
-        </w:tc>
-        <w:tc>
-          <w:tcPr>
-            <w:tcW w:w="1559" w:type="dxa"/>
-            <w:vAlign w:val="center"/>
-          </w:tcPr>
-          <w:p>
-            <w:pPr>
-              <w:jc w:val="center"/>
-            </w:pPr>
-            <w:r>
-              <w:t>-</w:t>
-            </w:r>
           </w:p>
         </w:tc>
       </w:tr>
       <w:tr>
-        <w:tc>
-          <w:tcPr>
-            <w:tcW w:w="1418" w:type="dxa"/>
-            <w:shd w:val="clear" w:color="auto" w:fill="BDD6EE"/>
-          </w:tcPr>
-          <w:p>
-            <w:pPr>
-              <w:jc w:val="center"/>
-            </w:pPr>
-            <w:r>
-              <w:t>Team Member E:</w:t>
-            </w:r>
-          </w:p>
-          <w:p>
-            <w:pPr>
-              <w:jc w:val="center"/>
-            </w:pPr>
-            <w:r>
-              <w:t xml:space="preserve">_ _ _ _ _ _ _ </w:t>
-            </w:r>
-          </w:p>
-        </w:tc>
-        <w:tc>
-          <w:tcPr>
-            <w:tcW w:w="1559" w:type="dxa"/>
-            <w:vAlign w:val="center"/>
-          </w:tcPr>
-          <w:p>
-            <w:pPr>
-              <w:jc w:val="center"/>
-            </w:pPr>
-            <w:r>
-              <w:t>-</w:t>
-            </w:r>
-          </w:p>
-        </w:tc>
-        <w:tc>
-          <w:tcPr>
-            <w:tcW w:w="1559" w:type="dxa"/>
-            <w:vAlign w:val="center"/>
-          </w:tcPr>
-          <w:p>
-            <w:pPr>
-              <w:jc w:val="center"/>
-            </w:pPr>
-            <w:r>
-              <w:t>-</w:t>
-            </w:r>
-          </w:p>
-        </w:tc>
-        <w:tc>
-          <w:tcPr>
-            <w:tcW w:w="1560" w:type="dxa"/>
-            <w:vAlign w:val="center"/>
-          </w:tcPr>
-          <w:p>
-            <w:pPr>
-              <w:jc w:val="center"/>
-            </w:pPr>
-            <w:r>
-              <w:t>-</w:t>
-            </w:r>
-          </w:p>
-        </w:tc>
-        <w:tc>
-          <w:tcPr>
-            <w:tcW w:w="1559" w:type="dxa"/>
-            <w:vAlign w:val="center"/>
-          </w:tcPr>
-          <w:p>
-            <w:pPr>
-              <w:jc w:val="center"/>
-            </w:pPr>
-            <w:r>
-              <w:t>-</w:t>
-            </w:r>
-          </w:p>
-        </w:tc>
-        <w:tc>
-          <w:tcPr>
-            <w:tcW w:w="1559" w:type="dxa"/>
-            <w:shd w:val="clear" w:color="auto" w:fill="595959"/>
-            <w:vAlign w:val="center"/>
-          </w:tcPr>
-          <w:p>
-            <w:pPr>
-              <w:jc w:val="center"/>
-            </w:pPr>
-          </w:p>
-        </w:tc>
-      </w:tr>
-      <w:tr>
-        <w:tc>
-          <w:tcPr>
-            <w:tcW w:w="1418" w:type="dxa"/>
+        <w:trPr>
+          <w:trHeight w:val="1080"/>
+        </w:trPr>
+        <w:tc>
+          <w:tcPr>
+            <w:tcW w:w="1601" w:type="dxa"/>
             <w:shd w:val="clear" w:color="auto" w:fill="92D050"/>
           </w:tcPr>
           <w:p>
@@ -741,7 +569,7 @@
         </w:tc>
         <w:tc>
           <w:tcPr>
-            <w:tcW w:w="1559" w:type="dxa"/>
+            <w:tcW w:w="1760" w:type="dxa"/>
             <w:shd w:val="clear" w:color="auto" w:fill="92D050"/>
             <w:vAlign w:val="center"/>
           </w:tcPr>
@@ -756,7 +584,7 @@
         </w:tc>
         <w:tc>
           <w:tcPr>
-            <w:tcW w:w="1559" w:type="dxa"/>
+            <w:tcW w:w="1760" w:type="dxa"/>
             <w:shd w:val="clear" w:color="auto" w:fill="92D050"/>
             <w:vAlign w:val="center"/>
           </w:tcPr>
@@ -771,7 +599,7 @@
         </w:tc>
         <w:tc>
           <w:tcPr>
-            <w:tcW w:w="1560" w:type="dxa"/>
+            <w:tcW w:w="1761" w:type="dxa"/>
             <w:shd w:val="clear" w:color="auto" w:fill="92D050"/>
             <w:vAlign w:val="center"/>
           </w:tcPr>
@@ -786,7 +614,7 @@
         </w:tc>
         <w:tc>
           <w:tcPr>
-            <w:tcW w:w="1559" w:type="dxa"/>
+            <w:tcW w:w="1760" w:type="dxa"/>
             <w:shd w:val="clear" w:color="auto" w:fill="92D050"/>
             <w:vAlign w:val="center"/>
           </w:tcPr>
@@ -797,27 +625,6 @@
                 <w:b/>
               </w:rPr>
             </w:pPr>
-          </w:p>
-        </w:tc>
-        <w:tc>
-          <w:tcPr>
-            <w:tcW w:w="1559" w:type="dxa"/>
-            <w:shd w:val="clear" w:color="auto" w:fill="92D050"/>
-            <w:vAlign w:val="center"/>
-          </w:tcPr>
-          <w:p>
-            <w:pPr>
-              <w:jc w:val="center"/>
-              <w:rPr>
-                <w:b/>
-              </w:rPr>
-            </w:pPr>
-            <w:r>
-              <w:rPr>
-                <w:b/>
-              </w:rPr>
-              <w:t>-</w:t>
-            </w:r>
           </w:p>
         </w:tc>
       </w:tr>
@@ -1809,6 +1616,7 @@
   <w:style w:type="character" w:default="1" w:styleId="DefaultParagraphFont">
     <w:name w:val="Default Paragraph Font"/>
     <w:uiPriority w:val="1"/>
+    <w:semiHidden/>
     <w:unhideWhenUsed/>
   </w:style>
   <w:style w:type="table" w:default="1" w:styleId="TableNormal">

</xml_diff>